<commit_message>
Update docx templates for uppercase titles
</commit_message>
<xml_diff>
--- a/src/templates/pemeriksaan-revisi/template_ba_pemeriksaan_revisi.docx
+++ b/src/templates/pemeriksaan-revisi/template_ba_pemeriksaan_revisi.docx
@@ -545,59 +545,23 @@
           <w:sz w:val="24"/>
           <w:szCs w:val="24"/>
         </w:rPr>
-        <w:t>{</w:t>
-      </w:r>
-      <w:proofErr w:type="spellStart"/>
+        <w:t>{NAMA_KEGIATAN}</w:t>
+      </w:r>
       <w:r>
         <w:rPr>
           <w:rFonts w:ascii="Times New Roman" w:hAnsi="Times New Roman"/>
           <w:sz w:val="24"/>
           <w:szCs w:val="24"/>
         </w:rPr>
-        <w:t>nama_kegiatan</w:t>
-      </w:r>
-      <w:proofErr w:type="spellEnd"/>
+        <w:t xml:space="preserve"> </w:t>
+      </w:r>
       <w:r>
         <w:rPr>
           <w:rFonts w:ascii="Times New Roman" w:hAnsi="Times New Roman"/>
           <w:sz w:val="24"/>
           <w:szCs w:val="24"/>
         </w:rPr>
-        <w:t>}</w:t>
-      </w:r>
-      <w:r>
-        <w:rPr>
-          <w:rFonts w:ascii="Times New Roman" w:hAnsi="Times New Roman"/>
-          <w:sz w:val="24"/>
-          <w:szCs w:val="24"/>
-        </w:rPr>
-        <w:t xml:space="preserve"> </w:t>
-      </w:r>
-      <w:r>
-        <w:rPr>
-          <w:rFonts w:ascii="Times New Roman" w:hAnsi="Times New Roman"/>
-          <w:sz w:val="24"/>
-          <w:szCs w:val="24"/>
-        </w:rPr>
-        <w:t>{</w:t>
-      </w:r>
-      <w:proofErr w:type="spellStart"/>
-      <w:r>
-        <w:rPr>
-          <w:rFonts w:ascii="Times New Roman" w:hAnsi="Times New Roman"/>
-          <w:sz w:val="24"/>
-          <w:szCs w:val="24"/>
-        </w:rPr>
-        <w:t>nama_perusahaan</w:t>
-      </w:r>
-      <w:proofErr w:type="spellEnd"/>
-      <w:r>
-        <w:rPr>
-          <w:rFonts w:ascii="Times New Roman" w:hAnsi="Times New Roman"/>
-          <w:sz w:val="24"/>
-          <w:szCs w:val="24"/>
-        </w:rPr>
-        <w:t xml:space="preserve">} </w:t>
+        <w:t xml:space="preserve">{NAMA_PERUSAHAAN} </w:t>
       </w:r>
     </w:p>
     <w:p>
@@ -628,25 +592,7 @@
           <w:sz w:val="24"/>
           <w:szCs w:val="24"/>
         </w:rPr>
-        <w:t>{</w:t>
-      </w:r>
-      <w:proofErr w:type="spellStart"/>
-      <w:r>
-        <w:rPr>
-          <w:rFonts w:ascii="Times New Roman" w:hAnsi="Times New Roman"/>
-          <w:sz w:val="24"/>
-          <w:szCs w:val="24"/>
-        </w:rPr>
-        <w:t>lokasi_kegiatan</w:t>
-      </w:r>
-      <w:proofErr w:type="spellEnd"/>
-      <w:r>
-        <w:rPr>
-          <w:rFonts w:ascii="Times New Roman" w:hAnsi="Times New Roman"/>
-          <w:sz w:val="24"/>
-          <w:szCs w:val="24"/>
-        </w:rPr>
-        <w:t>}</w:t>
+        <w:t>{LOKASI_KEGIATAN}</w:t>
       </w:r>
     </w:p>
     <w:p>

</xml_diff>